<commit_message>
Basel Problem Solution [Revised] || (08:08 (W.I.B[Waktu Indonesia bagian Barat]), 09/05/2026), Batam, Kepulauan Riau, Indonesia || Basel Problem Solution [Revised]
Basel Problem Solution [Revised] || (08:08 (W.I.B[Waktu Indonesia bagian Barat]), 09/05/2026), Batam, Kepulauan Riau, Indonesia || Basel Problem Solution [Revised]
</commit_message>
<xml_diff>
--- a/Basel Problem Solution.docx
+++ b/Basel Problem Solution.docx
@@ -248,32 +248,7 @@
                       <w:sz w:val="24"/>
                       <w:szCs w:val="24"/>
                     </w:rPr>
-                    <m:t>x = 1</m:t>
-                  </m:r>
-                </m:e>
-              </m:d>
-            </m:sub>
-            <m:sup>
-              <m:d>
-                <m:dPr>
-                  <m:ctrlPr>
-                    <w:rPr>
-                      <w:rFonts w:ascii="Cambria Math" w:hAnsi="Cambria Math" w:cs="Times New Roman"/>
-                      <w:i/>
-                      <w:sz w:val="24"/>
-                      <w:szCs w:val="24"/>
-                    </w:rPr>
-                  </m:ctrlPr>
-                </m:dPr>
-                <m:e>
-                  <m:r>
-                    <w:rPr>
-                      <w:rFonts w:ascii="Cambria Math" w:hAnsi="Cambria Math" w:cs="Times New Roman"/>
-                      <w:sz w:val="24"/>
-                      <w:szCs w:val="24"/>
-                      <w:lang w:val="id-ID"/>
-                    </w:rPr>
-                    <m:t>n</m:t>
+                    <m:t xml:space="preserve">x = </m:t>
                   </m:r>
                   <m:r>
                     <w:rPr>
@@ -282,7 +257,7 @@
                       <w:szCs w:val="24"/>
                       <w:lang w:val="id-ID"/>
                     </w:rPr>
-                    <m:t xml:space="preserve"> = ζ</m:t>
+                    <m:t>ζ</m:t>
                   </m:r>
                   <m:d>
                     <m:dPr>
@@ -343,6 +318,30 @@
                       </m:r>
                     </m:e>
                   </m:d>
+                </m:e>
+              </m:d>
+            </m:sub>
+            <m:sup>
+              <m:d>
+                <m:dPr>
+                  <m:ctrlPr>
+                    <w:rPr>
+                      <w:rFonts w:ascii="Cambria Math" w:hAnsi="Cambria Math" w:cs="Times New Roman"/>
+                      <w:i/>
+                      <w:sz w:val="24"/>
+                      <w:szCs w:val="24"/>
+                    </w:rPr>
+                  </m:ctrlPr>
+                </m:dPr>
+                <m:e>
+                  <m:r>
+                    <w:rPr>
+                      <w:rFonts w:ascii="Cambria Math" w:hAnsi="Cambria Math" w:cs="Times New Roman"/>
+                      <w:sz w:val="24"/>
+                      <w:szCs w:val="24"/>
+                    </w:rPr>
+                    <m:t>n = 2</m:t>
+                  </m:r>
                 </m:e>
               </m:d>
             </m:sup>
@@ -554,15 +553,7 @@
                       <w:sz w:val="24"/>
                       <w:szCs w:val="24"/>
                     </w:rPr>
-                    <m:t xml:space="preserve">7 × </m:t>
-                  </m:r>
-                  <m:r>
-                    <w:rPr>
-                      <w:rFonts w:ascii="Cambria Math" w:hAnsi="Cambria Math" w:cs="Times New Roman"/>
-                      <w:sz w:val="24"/>
-                      <w:szCs w:val="24"/>
-                    </w:rPr>
-                    <m:t>π</m:t>
+                    <m:t>7 × π</m:t>
                   </m:r>
                 </m:e>
               </m:d>
@@ -639,15 +630,7 @@
               <w:sz w:val="24"/>
               <w:szCs w:val="24"/>
             </w:rPr>
-            <m:t>π</m:t>
-          </m:r>
-          <m:r>
-            <w:rPr>
-              <w:rFonts w:ascii="Cambria Math" w:hAnsi="Cambria Math" w:cs="Times New Roman"/>
-              <w:sz w:val="24"/>
-              <w:szCs w:val="24"/>
-            </w:rPr>
-            <m:t xml:space="preserve"> = </m:t>
+            <m:t xml:space="preserve">π = </m:t>
           </m:r>
           <m:sSup>
             <m:sSupPr>
@@ -727,24 +710,8 @@
                                   <w:sz w:val="24"/>
                                   <w:szCs w:val="24"/>
                                 </w:rPr>
-                                <m:t>x = 1</m:t>
+                                <m:t xml:space="preserve">x = </m:t>
                               </m:r>
-                            </m:e>
-                          </m:d>
-                        </m:sub>
-                        <m:sup>
-                          <m:d>
-                            <m:dPr>
-                              <m:ctrlPr>
-                                <w:rPr>
-                                  <w:rFonts w:ascii="Cambria Math" w:hAnsi="Cambria Math" w:cs="Times New Roman"/>
-                                  <w:i/>
-                                  <w:sz w:val="24"/>
-                                  <w:szCs w:val="24"/>
-                                </w:rPr>
-                              </m:ctrlPr>
-                            </m:dPr>
-                            <m:e>
                               <m:r>
                                 <w:rPr>
                                   <w:rFonts w:ascii="Cambria Math" w:hAnsi="Cambria Math" w:cs="Times New Roman"/>
@@ -752,7 +719,7 @@
                                   <w:szCs w:val="24"/>
                                   <w:lang w:val="id-ID"/>
                                 </w:rPr>
-                                <m:t>n = ζ</m:t>
+                                <m:t>ζ</m:t>
                               </m:r>
                               <m:d>
                                 <m:dPr>
@@ -813,6 +780,30 @@
                                   </m:r>
                                 </m:e>
                               </m:d>
+                            </m:e>
+                          </m:d>
+                        </m:sub>
+                        <m:sup>
+                          <m:d>
+                            <m:dPr>
+                              <m:ctrlPr>
+                                <w:rPr>
+                                  <w:rFonts w:ascii="Cambria Math" w:hAnsi="Cambria Math" w:cs="Times New Roman"/>
+                                  <w:i/>
+                                  <w:sz w:val="24"/>
+                                  <w:szCs w:val="24"/>
+                                </w:rPr>
+                              </m:ctrlPr>
+                            </m:dPr>
+                            <m:e>
+                              <m:r>
+                                <w:rPr>
+                                  <w:rFonts w:ascii="Cambria Math" w:hAnsi="Cambria Math" w:cs="Times New Roman"/>
+                                  <w:sz w:val="24"/>
+                                  <w:szCs w:val="24"/>
+                                </w:rPr>
+                                <m:t>n = 2</m:t>
+                              </m:r>
                             </m:e>
                           </m:d>
                         </m:sup>
@@ -1090,24 +1081,8 @@
                                           <w:sz w:val="24"/>
                                           <w:szCs w:val="24"/>
                                         </w:rPr>
-                                        <m:t>x = 1</m:t>
+                                        <m:t xml:space="preserve">x = </m:t>
                                       </m:r>
-                                    </m:e>
-                                  </m:d>
-                                </m:sub>
-                                <m:sup>
-                                  <m:d>
-                                    <m:dPr>
-                                      <m:ctrlPr>
-                                        <w:rPr>
-                                          <w:rFonts w:ascii="Cambria Math" w:hAnsi="Cambria Math" w:cs="Times New Roman"/>
-                                          <w:i/>
-                                          <w:sz w:val="24"/>
-                                          <w:szCs w:val="24"/>
-                                        </w:rPr>
-                                      </m:ctrlPr>
-                                    </m:dPr>
-                                    <m:e>
                                       <m:r>
                                         <w:rPr>
                                           <w:rFonts w:ascii="Cambria Math" w:hAnsi="Cambria Math" w:cs="Times New Roman"/>
@@ -1115,7 +1090,7 @@
                                           <w:szCs w:val="24"/>
                                           <w:lang w:val="id-ID"/>
                                         </w:rPr>
-                                        <m:t>n = ζ</m:t>
+                                        <m:t>ζ</m:t>
                                       </m:r>
                                       <m:d>
                                         <m:dPr>
@@ -1176,6 +1151,30 @@
                                           </m:r>
                                         </m:e>
                                       </m:d>
+                                    </m:e>
+                                  </m:d>
+                                </m:sub>
+                                <m:sup>
+                                  <m:d>
+                                    <m:dPr>
+                                      <m:ctrlPr>
+                                        <w:rPr>
+                                          <w:rFonts w:ascii="Cambria Math" w:hAnsi="Cambria Math" w:cs="Times New Roman"/>
+                                          <w:i/>
+                                          <w:sz w:val="24"/>
+                                          <w:szCs w:val="24"/>
+                                        </w:rPr>
+                                      </m:ctrlPr>
+                                    </m:dPr>
+                                    <m:e>
+                                      <m:r>
+                                        <w:rPr>
+                                          <w:rFonts w:ascii="Cambria Math" w:hAnsi="Cambria Math" w:cs="Times New Roman"/>
+                                          <w:sz w:val="24"/>
+                                          <w:szCs w:val="24"/>
+                                        </w:rPr>
+                                        <m:t>n = 2</m:t>
+                                      </m:r>
                                     </m:e>
                                   </m:d>
                                 </m:sup>
@@ -1359,24 +1358,8 @@
                       <w:sz w:val="24"/>
                       <w:szCs w:val="24"/>
                     </w:rPr>
-                    <m:t>x = 1</m:t>
+                    <m:t xml:space="preserve">x = </m:t>
                   </m:r>
-                </m:e>
-              </m:d>
-            </m:sub>
-            <m:sup>
-              <m:d>
-                <m:dPr>
-                  <m:ctrlPr>
-                    <w:rPr>
-                      <w:rFonts w:ascii="Cambria Math" w:hAnsi="Cambria Math" w:cs="Times New Roman"/>
-                      <w:i/>
-                      <w:sz w:val="24"/>
-                      <w:szCs w:val="24"/>
-                    </w:rPr>
-                  </m:ctrlPr>
-                </m:dPr>
-                <m:e>
                   <m:r>
                     <w:rPr>
                       <w:rFonts w:ascii="Cambria Math" w:hAnsi="Cambria Math" w:cs="Times New Roman"/>
@@ -1384,7 +1367,7 @@
                       <w:szCs w:val="24"/>
                       <w:lang w:val="id-ID"/>
                     </w:rPr>
-                    <m:t>n = ζ</m:t>
+                    <m:t>ζ</m:t>
                   </m:r>
                   <m:d>
                     <m:dPr>
@@ -1445,6 +1428,30 @@
                       </m:r>
                     </m:e>
                   </m:d>
+                </m:e>
+              </m:d>
+            </m:sub>
+            <m:sup>
+              <m:d>
+                <m:dPr>
+                  <m:ctrlPr>
+                    <w:rPr>
+                      <w:rFonts w:ascii="Cambria Math" w:hAnsi="Cambria Math" w:cs="Times New Roman"/>
+                      <w:i/>
+                      <w:sz w:val="24"/>
+                      <w:szCs w:val="24"/>
+                    </w:rPr>
+                  </m:ctrlPr>
+                </m:dPr>
+                <m:e>
+                  <m:r>
+                    <w:rPr>
+                      <w:rFonts w:ascii="Cambria Math" w:hAnsi="Cambria Math" w:cs="Times New Roman"/>
+                      <w:sz w:val="24"/>
+                      <w:szCs w:val="24"/>
+                    </w:rPr>
+                    <m:t>n = 2</m:t>
+                  </m:r>
                 </m:e>
               </m:d>
             </m:sup>
@@ -1696,24 +1703,8 @@
                       <w:sz w:val="24"/>
                       <w:szCs w:val="24"/>
                     </w:rPr>
-                    <m:t>x = 1</m:t>
+                    <m:t xml:space="preserve">x = </m:t>
                   </m:r>
-                </m:e>
-              </m:d>
-            </m:sub>
-            <m:sup>
-              <m:d>
-                <m:dPr>
-                  <m:ctrlPr>
-                    <w:rPr>
-                      <w:rFonts w:ascii="Cambria Math" w:hAnsi="Cambria Math" w:cs="Times New Roman"/>
-                      <w:i/>
-                      <w:sz w:val="24"/>
-                      <w:szCs w:val="24"/>
-                    </w:rPr>
-                  </m:ctrlPr>
-                </m:dPr>
-                <m:e>
                   <m:r>
                     <w:rPr>
                       <w:rFonts w:ascii="Cambria Math" w:hAnsi="Cambria Math" w:cs="Times New Roman"/>
@@ -1721,7 +1712,7 @@
                       <w:szCs w:val="24"/>
                       <w:lang w:val="id-ID"/>
                     </w:rPr>
-                    <m:t>n = ζ</m:t>
+                    <m:t>ζ</m:t>
                   </m:r>
                   <m:d>
                     <m:dPr>
@@ -1782,6 +1773,30 @@
                       </m:r>
                     </m:e>
                   </m:d>
+                </m:e>
+              </m:d>
+            </m:sub>
+            <m:sup>
+              <m:d>
+                <m:dPr>
+                  <m:ctrlPr>
+                    <w:rPr>
+                      <w:rFonts w:ascii="Cambria Math" w:hAnsi="Cambria Math" w:cs="Times New Roman"/>
+                      <w:i/>
+                      <w:sz w:val="24"/>
+                      <w:szCs w:val="24"/>
+                    </w:rPr>
+                  </m:ctrlPr>
+                </m:dPr>
+                <m:e>
+                  <m:r>
+                    <w:rPr>
+                      <w:rFonts w:ascii="Cambria Math" w:hAnsi="Cambria Math" w:cs="Times New Roman"/>
+                      <w:sz w:val="24"/>
+                      <w:szCs w:val="24"/>
+                    </w:rPr>
+                    <m:t>n = 2</m:t>
+                  </m:r>
                 </m:e>
               </m:d>
             </m:sup>
@@ -1864,15 +1879,7 @@
               <w:sz w:val="24"/>
               <w:szCs w:val="24"/>
             </w:rPr>
-            <m:t xml:space="preserve"> = </m:t>
-          </m:r>
-          <m:r>
-            <w:rPr>
-              <w:rFonts w:ascii="Cambria Math" w:hAnsi="Cambria Math" w:cs="Times New Roman"/>
-              <w:sz w:val="24"/>
-              <w:szCs w:val="24"/>
-            </w:rPr>
-            <m:t>1,6462585034013605442176870748299</m:t>
+            <m:t xml:space="preserve"> = 1,6462585034013605442176870748299</m:t>
           </m:r>
         </m:oMath>
       </m:oMathPara>
@@ -2075,12 +2082,12 @@
       </w:r>
     </w:p>
     <w:sectPr>
-      <w:headerReference w:type="even" r:id="rId4"/>
-      <w:headerReference w:type="default" r:id="rId5"/>
-      <w:footerReference w:type="even" r:id="rId6"/>
-      <w:footerReference w:type="default" r:id="rId7"/>
-      <w:headerReference w:type="first" r:id="rId8"/>
-      <w:footerReference w:type="first" r:id="rId9"/>
+      <w:headerReference w:type="even" r:id="rId6"/>
+      <w:headerReference w:type="default" r:id="rId7"/>
+      <w:footerReference w:type="even" r:id="rId8"/>
+      <w:footerReference w:type="default" r:id="rId9"/>
+      <w:headerReference w:type="first" r:id="rId10"/>
+      <w:footerReference w:type="first" r:id="rId11"/>
       <w:pgSz w:w="11906" w:h="16838" w:code="9"/>
       <w:pgMar w:top="1701" w:right="2268" w:bottom="2268" w:left="1701" w:header="708" w:footer="708" w:gutter="0"/>
       <w:cols w:space="708"/>
@@ -2088,6 +2095,31 @@
     </w:sectPr>
   </w:body>
 </w:document>
+</file>
+
+<file path=word/endnotes.xml><?xml version="1.0" encoding="utf-8"?>
+<w:endnotes xmlns:wpc="http://schemas.microsoft.com/office/word/2010/wordprocessingCanvas" xmlns:cx="http://schemas.microsoft.com/office/drawing/2014/chartex" xmlns:cx1="http://schemas.microsoft.com/office/drawing/2015/9/8/chartex" xmlns:cx2="http://schemas.microsoft.com/office/drawing/2015/10/21/chartex" xmlns:cx3="http://schemas.microsoft.com/office/drawing/2016/5/9/chartex" xmlns:cx4="http://schemas.microsoft.com/office/drawing/2016/5/10/chartex" xmlns:cx5="http://schemas.microsoft.com/office/drawing/2016/5/11/chartex" xmlns:cx6="http://schemas.microsoft.com/office/drawing/2016/5/12/chartex" xmlns:cx7="http://schemas.microsoft.com/office/drawing/2016/5/13/chartex" xmlns:cx8="http://schemas.microsoft.com/office/drawing/2016/5/14/chartex" xmlns:mc="http://schemas.openxmlformats.org/markup-compatibility/2006" xmlns:aink="http://schemas.microsoft.com/office/drawing/2016/ink" xmlns:am3d="http://schemas.microsoft.com/office/drawing/2017/model3d" xmlns:o="urn:schemas-microsoft-com:office:office" xmlns:oel="http://schemas.microsoft.com/office/2019/extlst" xmlns:r="http://schemas.openxmlformats.org/officeDocument/2006/relationships" xmlns:m="http://schemas.openxmlformats.org/officeDocument/2006/math" xmlns:v="urn:schemas-microsoft-com:vml" xmlns:wp14="http://schemas.microsoft.com/office/word/2010/wordprocessingDrawing" xmlns:wp="http://schemas.openxmlformats.org/drawingml/2006/wordprocessingDrawing" xmlns:w10="urn:schemas-microsoft-com:office:word" xmlns:w="http://schemas.openxmlformats.org/wordprocessingml/2006/main" xmlns:w14="http://schemas.microsoft.com/office/word/2010/wordml" xmlns:w15="http://schemas.microsoft.com/office/word/2012/wordml" xmlns:w16cex="http://schemas.microsoft.com/office/word/2018/wordml/cex" xmlns:w16cid="http://schemas.microsoft.com/office/word/2016/wordml/cid" xmlns:w16="http://schemas.microsoft.com/office/word/2018/wordml" xmlns:w16sdtdh="http://schemas.microsoft.com/office/word/2020/wordml/sdtdatahash" xmlns:w16se="http://schemas.microsoft.com/office/word/2015/wordml/symex" xmlns:wpg="http://schemas.microsoft.com/office/word/2010/wordprocessingGroup" xmlns:wpi="http://schemas.microsoft.com/office/word/2010/wordprocessingInk" xmlns:wne="http://schemas.microsoft.com/office/word/2006/wordml" xmlns:wps="http://schemas.microsoft.com/office/word/2010/wordprocessingShape" mc:Ignorable="w14 w15 w16se w16cid w16 w16cex w16sdtdh wp14">
+  <w:endnote w:type="separator" w:id="-1">
+    <w:p>
+      <w:pPr>
+        <w:spacing w:after="0" w:line="240" w:lineRule="auto"/>
+      </w:pPr>
+      <w:r>
+        <w:separator/>
+      </w:r>
+    </w:p>
+  </w:endnote>
+  <w:endnote w:type="continuationSeparator" w:id="0">
+    <w:p>
+      <w:pPr>
+        <w:spacing w:after="0" w:line="240" w:lineRule="auto"/>
+      </w:pPr>
+      <w:r>
+        <w:continuationSeparator/>
+      </w:r>
+    </w:p>
+  </w:endnote>
+</w:endnotes>
 </file>
 
 <file path=word/footer1.xml><?xml version="1.0" encoding="utf-8"?>
@@ -2118,6 +2150,31 @@
     </w:pPr>
   </w:p>
 </w:ftr>
+</file>
+
+<file path=word/footnotes.xml><?xml version="1.0" encoding="utf-8"?>
+<w:footnotes xmlns:wpc="http://schemas.microsoft.com/office/word/2010/wordprocessingCanvas" xmlns:cx="http://schemas.microsoft.com/office/drawing/2014/chartex" xmlns:cx1="http://schemas.microsoft.com/office/drawing/2015/9/8/chartex" xmlns:cx2="http://schemas.microsoft.com/office/drawing/2015/10/21/chartex" xmlns:cx3="http://schemas.microsoft.com/office/drawing/2016/5/9/chartex" xmlns:cx4="http://schemas.microsoft.com/office/drawing/2016/5/10/chartex" xmlns:cx5="http://schemas.microsoft.com/office/drawing/2016/5/11/chartex" xmlns:cx6="http://schemas.microsoft.com/office/drawing/2016/5/12/chartex" xmlns:cx7="http://schemas.microsoft.com/office/drawing/2016/5/13/chartex" xmlns:cx8="http://schemas.microsoft.com/office/drawing/2016/5/14/chartex" xmlns:mc="http://schemas.openxmlformats.org/markup-compatibility/2006" xmlns:aink="http://schemas.microsoft.com/office/drawing/2016/ink" xmlns:am3d="http://schemas.microsoft.com/office/drawing/2017/model3d" xmlns:o="urn:schemas-microsoft-com:office:office" xmlns:oel="http://schemas.microsoft.com/office/2019/extlst" xmlns:r="http://schemas.openxmlformats.org/officeDocument/2006/relationships" xmlns:m="http://schemas.openxmlformats.org/officeDocument/2006/math" xmlns:v="urn:schemas-microsoft-com:vml" xmlns:wp14="http://schemas.microsoft.com/office/word/2010/wordprocessingDrawing" xmlns:wp="http://schemas.openxmlformats.org/drawingml/2006/wordprocessingDrawing" xmlns:w10="urn:schemas-microsoft-com:office:word" xmlns:w="http://schemas.openxmlformats.org/wordprocessingml/2006/main" xmlns:w14="http://schemas.microsoft.com/office/word/2010/wordml" xmlns:w15="http://schemas.microsoft.com/office/word/2012/wordml" xmlns:w16cex="http://schemas.microsoft.com/office/word/2018/wordml/cex" xmlns:w16cid="http://schemas.microsoft.com/office/word/2016/wordml/cid" xmlns:w16="http://schemas.microsoft.com/office/word/2018/wordml" xmlns:w16sdtdh="http://schemas.microsoft.com/office/word/2020/wordml/sdtdatahash" xmlns:w16se="http://schemas.microsoft.com/office/word/2015/wordml/symex" xmlns:wpg="http://schemas.microsoft.com/office/word/2010/wordprocessingGroup" xmlns:wpi="http://schemas.microsoft.com/office/word/2010/wordprocessingInk" xmlns:wne="http://schemas.microsoft.com/office/word/2006/wordml" xmlns:wps="http://schemas.microsoft.com/office/word/2010/wordprocessingShape" mc:Ignorable="w14 w15 w16se w16cid w16 w16cex w16sdtdh wp14">
+  <w:footnote w:type="separator" w:id="-1">
+    <w:p>
+      <w:pPr>
+        <w:spacing w:after="0" w:line="240" w:lineRule="auto"/>
+      </w:pPr>
+      <w:r>
+        <w:separator/>
+      </w:r>
+    </w:p>
+  </w:footnote>
+  <w:footnote w:type="continuationSeparator" w:id="0">
+    <w:p>
+      <w:pPr>
+        <w:spacing w:after="0" w:line="240" w:lineRule="auto"/>
+      </w:pPr>
+      <w:r>
+        <w:continuationSeparator/>
+      </w:r>
+    </w:p>
+  </w:footnote>
+</w:footnotes>
 </file>
 
 <file path=word/header1.xml><?xml version="1.0" encoding="utf-8"?>
@@ -2171,7 +2228,7 @@
               </v:handles>
               <o:lock v:ext="edit" text="t" shapetype="t"/>
             </v:shapetype>
-            <v:shape id="PowerPlusWaterMarkObject9268752" o:spid="_x0000_s1025" type="#_x0000_t136" style="position:absolute;margin-left:0;margin-top:0;width:544.4pt;height:14.9pt;rotation:315;z-index:-251657216;mso-position-horizontal:center;mso-position-horizontal-relative:margin;mso-position-vertical:center;mso-position-vertical-relative:margin" o:allowincell="f" fillcolor="#c1e4f5 [660]" stroked="f">
+            <v:shape id="PowerPlusWaterMarkObject9268752" o:spid="_x0000_s1025" type="#_x0000_t136" style="position:absolute;margin-left:0;margin-top:0;width:544.4pt;height:14.9pt;rotation:315;z-index:-251658752;mso-position-horizontal:center;mso-position-horizontal-relative:margin;mso-position-vertical:center;mso-position-vertical-relative:margin" o:allowincell="f" fillcolor="#c1e4f5 [660]" stroked="f">
               <v:fill opacity=".5"/>
               <v:textpath style="font-family:&quot;Times New Roman&quot;;font-size:1pt" string="#LAWANPEMERINTAHINDONESIAKORUPPENDINDASRAKYATINDONESIADENGANPENGETAHUAN"/>
               <w10:wrap anchorx="margin" anchory="margin"/>

</xml_diff>

<commit_message>
Basel Problem Solution [Revised] || (19:43 (W.I.B[Waktu Indonesia bagian Barat]), 16/05/2026), Batam, Kepulauan Riau, Indonesia || Basel Problem Solution [Revised]
Basel Problem Solution [Revised] || (19:43 (W.I.B[Waktu Indonesia bagian Barat]), 16/05/2026), Batam, Kepulauan Riau, Indonesia || Basel Problem Solution [Revised]
</commit_message>
<xml_diff>
--- a/Basel Problem Solution.docx
+++ b/Basel Problem Solution.docx
@@ -220,6 +220,7 @@
             <m:naryPr>
               <m:chr m:val="∑"/>
               <m:limLoc m:val="undOvr"/>
+              <m:supHide m:val="1"/>
               <m:ctrlPr>
                 <w:rPr>
                   <w:rFonts w:ascii="Cambria Math" w:hAnsi="Cambria Math" w:cs="Times New Roman"/>
@@ -321,30 +322,7 @@
                 </m:e>
               </m:d>
             </m:sub>
-            <m:sup>
-              <m:d>
-                <m:dPr>
-                  <m:ctrlPr>
-                    <w:rPr>
-                      <w:rFonts w:ascii="Cambria Math" w:hAnsi="Cambria Math" w:cs="Times New Roman"/>
-                      <w:i/>
-                      <w:sz w:val="24"/>
-                      <w:szCs w:val="24"/>
-                    </w:rPr>
-                  </m:ctrlPr>
-                </m:dPr>
-                <m:e>
-                  <m:r>
-                    <w:rPr>
-                      <w:rFonts w:ascii="Cambria Math" w:hAnsi="Cambria Math" w:cs="Times New Roman"/>
-                      <w:sz w:val="24"/>
-                      <w:szCs w:val="24"/>
-                    </w:rPr>
-                    <m:t>n = 2</m:t>
-                  </m:r>
-                </m:e>
-              </m:d>
-            </m:sup>
+            <m:sup/>
             <m:e>
               <m:d>
                 <m:dPr>
@@ -408,7 +386,7 @@
                               <w:sz w:val="24"/>
                               <w:szCs w:val="24"/>
                             </w:rPr>
-                            <m:t>n</m:t>
+                            <m:t>2</m:t>
                           </m:r>
                         </m:sup>
                       </m:sSup>
@@ -682,6 +660,7 @@
                         <m:naryPr>
                           <m:chr m:val="∑"/>
                           <m:limLoc m:val="undOvr"/>
+                          <m:supHide m:val="1"/>
                           <m:ctrlPr>
                             <w:rPr>
                               <w:rFonts w:ascii="Cambria Math" w:hAnsi="Cambria Math" w:cs="Times New Roman"/>
@@ -783,30 +762,7 @@
                             </m:e>
                           </m:d>
                         </m:sub>
-                        <m:sup>
-                          <m:d>
-                            <m:dPr>
-                              <m:ctrlPr>
-                                <w:rPr>
-                                  <w:rFonts w:ascii="Cambria Math" w:hAnsi="Cambria Math" w:cs="Times New Roman"/>
-                                  <w:i/>
-                                  <w:sz w:val="24"/>
-                                  <w:szCs w:val="24"/>
-                                </w:rPr>
-                              </m:ctrlPr>
-                            </m:dPr>
-                            <m:e>
-                              <m:r>
-                                <w:rPr>
-                                  <w:rFonts w:ascii="Cambria Math" w:hAnsi="Cambria Math" w:cs="Times New Roman"/>
-                                  <w:sz w:val="24"/>
-                                  <w:szCs w:val="24"/>
-                                </w:rPr>
-                                <m:t>n = 2</m:t>
-                              </m:r>
-                            </m:e>
-                          </m:d>
-                        </m:sup>
+                        <m:sup/>
                         <m:e>
                           <m:d>
                             <m:dPr>
@@ -870,7 +826,7 @@
                                           <w:sz w:val="24"/>
                                           <w:szCs w:val="24"/>
                                         </w:rPr>
-                                        <m:t>n</m:t>
+                                        <m:t>2</m:t>
                                       </m:r>
                                     </m:sup>
                                   </m:sSup>
@@ -1053,6 +1009,7 @@
                                 <m:naryPr>
                                   <m:chr m:val="∑"/>
                                   <m:limLoc m:val="undOvr"/>
+                                  <m:supHide m:val="1"/>
                                   <m:ctrlPr>
                                     <w:rPr>
                                       <w:rFonts w:ascii="Cambria Math" w:hAnsi="Cambria Math" w:cs="Times New Roman"/>
@@ -1154,30 +1111,7 @@
                                     </m:e>
                                   </m:d>
                                 </m:sub>
-                                <m:sup>
-                                  <m:d>
-                                    <m:dPr>
-                                      <m:ctrlPr>
-                                        <w:rPr>
-                                          <w:rFonts w:ascii="Cambria Math" w:hAnsi="Cambria Math" w:cs="Times New Roman"/>
-                                          <w:i/>
-                                          <w:sz w:val="24"/>
-                                          <w:szCs w:val="24"/>
-                                        </w:rPr>
-                                      </m:ctrlPr>
-                                    </m:dPr>
-                                    <m:e>
-                                      <m:r>
-                                        <w:rPr>
-                                          <w:rFonts w:ascii="Cambria Math" w:hAnsi="Cambria Math" w:cs="Times New Roman"/>
-                                          <w:sz w:val="24"/>
-                                          <w:szCs w:val="24"/>
-                                        </w:rPr>
-                                        <m:t>n = 2</m:t>
-                                      </m:r>
-                                    </m:e>
-                                  </m:d>
-                                </m:sup>
+                                <m:sup/>
                                 <m:e>
                                   <m:d>
                                     <m:dPr>
@@ -1241,7 +1175,7 @@
                                                   <w:sz w:val="24"/>
                                                   <w:szCs w:val="24"/>
                                                 </w:rPr>
-                                                <m:t>n</m:t>
+                                                <m:t>2</m:t>
                                               </m:r>
                                             </m:sup>
                                           </m:sSup>
@@ -1330,6 +1264,7 @@
             <m:naryPr>
               <m:chr m:val="∑"/>
               <m:limLoc m:val="undOvr"/>
+              <m:supHide m:val="1"/>
               <m:ctrlPr>
                 <w:rPr>
                   <w:rFonts w:ascii="Cambria Math" w:hAnsi="Cambria Math" w:cs="Times New Roman"/>
@@ -1431,30 +1366,7 @@
                 </m:e>
               </m:d>
             </m:sub>
-            <m:sup>
-              <m:d>
-                <m:dPr>
-                  <m:ctrlPr>
-                    <w:rPr>
-                      <w:rFonts w:ascii="Cambria Math" w:hAnsi="Cambria Math" w:cs="Times New Roman"/>
-                      <w:i/>
-                      <w:sz w:val="24"/>
-                      <w:szCs w:val="24"/>
-                    </w:rPr>
-                  </m:ctrlPr>
-                </m:dPr>
-                <m:e>
-                  <m:r>
-                    <w:rPr>
-                      <w:rFonts w:ascii="Cambria Math" w:hAnsi="Cambria Math" w:cs="Times New Roman"/>
-                      <w:sz w:val="24"/>
-                      <w:szCs w:val="24"/>
-                    </w:rPr>
-                    <m:t>n = 2</m:t>
-                  </m:r>
-                </m:e>
-              </m:d>
-            </m:sup>
+            <m:sup/>
             <m:e>
               <m:d>
                 <m:dPr>
@@ -1518,7 +1430,7 @@
                               <w:sz w:val="24"/>
                               <w:szCs w:val="24"/>
                             </w:rPr>
-                            <m:t>n</m:t>
+                            <m:t>2</m:t>
                           </m:r>
                         </m:sup>
                       </m:sSup>
@@ -1675,6 +1587,7 @@
             <m:naryPr>
               <m:chr m:val="∑"/>
               <m:limLoc m:val="undOvr"/>
+              <m:supHide m:val="1"/>
               <m:ctrlPr>
                 <w:rPr>
                   <w:rFonts w:ascii="Cambria Math" w:hAnsi="Cambria Math" w:cs="Times New Roman"/>
@@ -1776,30 +1689,7 @@
                 </m:e>
               </m:d>
             </m:sub>
-            <m:sup>
-              <m:d>
-                <m:dPr>
-                  <m:ctrlPr>
-                    <w:rPr>
-                      <w:rFonts w:ascii="Cambria Math" w:hAnsi="Cambria Math" w:cs="Times New Roman"/>
-                      <w:i/>
-                      <w:sz w:val="24"/>
-                      <w:szCs w:val="24"/>
-                    </w:rPr>
-                  </m:ctrlPr>
-                </m:dPr>
-                <m:e>
-                  <m:r>
-                    <w:rPr>
-                      <w:rFonts w:ascii="Cambria Math" w:hAnsi="Cambria Math" w:cs="Times New Roman"/>
-                      <w:sz w:val="24"/>
-                      <w:szCs w:val="24"/>
-                    </w:rPr>
-                    <m:t>n = 2</m:t>
-                  </m:r>
-                </m:e>
-              </m:d>
-            </m:sup>
+            <m:sup/>
             <m:e>
               <m:d>
                 <m:dPr>
@@ -1863,7 +1753,7 @@
                               <w:sz w:val="24"/>
                               <w:szCs w:val="24"/>
                             </w:rPr>
-                            <m:t>n</m:t>
+                            <m:t>2</m:t>
                           </m:r>
                         </m:sup>
                       </m:sSup>

</xml_diff>